<commit_message>
Record v1.4.22 deployment in Board review
</commit_message>
<xml_diff>
--- a/proposals/NCSSAR_RID2Caltopo_technical_security_review.docx
+++ b/proposals/NCSSAR_RID2Caltopo_technical_security_review.docx
@@ -181,12 +181,7 @@
         <w:keepLines w:val="0"/>
       </w:pPr>
       <w:r>
-        <w:rPr>
-          <w:rFonts w:ascii="Calibri" w:hAnsi="Calibri"/>
-          <w:i w:val="0"/>
-          <w:color w:val="20262E"/>
-        </w:rPr>
-        <w:t>The program demonstrates a thoughtful security direction and now has a stronger, repeatable assurance baseline for its controlled pilot. In addition to organization-scoped authorization, CSRF protection, OAuth safeguards, revocable device credentials, audit events, private database routing, and explicit operator consent, the server source now includes an executable authorization inventory, exact dependency resolution, automated vulnerability/static/secret checks, CycloneDX SBOM generation, and fail-closed handling for unconfigured legacy credentials.</w:t>
+        <w:t>The program demonstrates a thoughtful security direction and now has a stronger, repeatable assurance baseline for its controlled pilot. In addition to organization-scoped authorization, CSRF protection, OAuth safeguards, revocable device credentials, audit events, private database routing, and explicit operator consent, the published server includes an executable authorization inventory, bounded archive restore, restricted browser CORS, production HSTS, exact dependency resolution, automated vulnerability/static/secret checks, CycloneDX SBOM generation, and fail-closed handling for unconfigured legacy credentials.</w:t>
       </w:r>
     </w:p>
     <w:p>
@@ -194,12 +189,7 @@
         <w:keepLines w:val="0"/>
       </w:pPr>
       <w:r>
-        <w:rPr>
-          <w:rFonts w:ascii="Calibri" w:hAnsi="Calibri"/>
-          <w:i w:val="0"/>
-          <w:color w:val="20262E"/>
-        </w:rPr>
-        <w:t>The present assurance level remains pilot-grade. No-outage database-host controls are live, including deletion protection, removal of unused public-web tags, and a logged public-RDP deny, but public SSH and the VM public IP remain until a maintenance-window repair proves IAP access. Board-controlled ownership and recovery identities, alert destinations, backup/restore evidence, an incident tabletop, independent tenant/cloud review, full cross-platform supply-chain coverage, and managed-video field qualification remain open.</w:t>
+        <w:t>The present assurance level remains pilot-grade. Tracker v1.4.22 is live on Cloud Run revision r2c-tracker-pilot-00089-8gd with 100 percent of traffic, and post-deployment checks confirmed its version record, HSTS, and rejection of an untrusted CORS preflight. Both public RID2Caltopo domains render the versioned best-effort acknowledgment. No-outage database-host controls are live, but public SSH and the VM public IP remain until a maintenance-window repair proves IAP access. Board-controlled ownership and recovery identities, alert destinations, backup/restore evidence, an incident tabletop, independent tenant/cloud review, full cross-platform supply-chain coverage, and managed-video field qualification remain open.</w:t>
       </w:r>
     </w:p>
     <w:p>
@@ -4260,7 +4250,7 @@
           </w:tcPr>
           <w:p>
             <w:r>
-              <w:t>Strong release-candidate baseline; commit/deployment evidence, independent review, physical-device checks, and full cross-platform provenance remain open.</w:t>
+              <w:t>Published release baseline: tracker v1.4.22 is live and RID2Caltopo 2.0.2 build 124 is tagged; independent review, store-distributed physical-device checks, and full cross-platform provenance remain open.</w:t>
             </w:r>
           </w:p>
         </w:tc>
@@ -5174,7 +5164,7 @@
           </w:tcPr>
           <w:p>
             <w:r>
-              <w:t>Browser CORS is now restricted and production HSTS is source-enforced; effective edge TLS/header coverage has not been independently verified after deployment.</w:t>
+              <w:t>Browser CORS is restricted and production HSTS is source-enforced. Live checks confirmed HSTS and rejection of an untrusted preflight without an allow-origin header; independent edge review remains open.</w:t>
             </w:r>
           </w:p>
         </w:tc>
@@ -5191,7 +5181,7 @@
           </w:tcPr>
           <w:p>
             <w:r>
-              <w:t>Retain the origin/method/header restriction and HSTS test; independently verify production edge behavior and sensitive-route coverage.</w:t>
+              <w:t>Retain the origin/method/header restriction and HSTS test; independently verify broader production edge behavior, rate limits, and sensitive-route coverage.</w:t>
             </w:r>
           </w:p>
         </w:tc>
@@ -9882,10 +9872,7 @@
         </w:numPr>
       </w:pPr>
       <w:r>
-        <w:rPr>
-          <w:rFonts w:ascii="Calibri" w:hAnsi="Calibri"/>
-        </w:rPr>
-        <w:t>Google Cloud observations and controlled changes on August 7-8, 2026: Cloud Run service/revision and IAM, runtime secret references and access roles, bucket controls/IAM, VPC routes, Compute Engine VM/disk posture, firewall rules, deletion protection, removal of unused public-web tags, logged RDP denial, and additive IAP access configuration. No secret payloads were accessed.</w:t>
+        <w:t>Google Cloud observations and controlled changes on August 7-8, 2026: Cloud Run service/revision and IAM, runtime secret references and access roles, bucket controls/IAM, VPC routes, Compute Engine VM/disk posture, firewall rules, deletion protection, removal of unused public-web tags, logged RDP denial, and additive IAP access configuration. Post-deployment evidence includes tracker revision r2c-tracker-pilot-00089-8gd at 100 percent traffic, live v1.4.22 release notes, HSTS, untrusted-origin CORS rejection, and both public RID2Caltopo acknowledgment pages. No secret payloads were accessed.</w:t>
       </w:r>
     </w:p>
     <w:p>
@@ -9901,12 +9888,7 @@
         <w:keepLines w:val="0"/>
       </w:pPr>
       <w:r>
-        <w:rPr>
-          <w:rFonts w:ascii="Calibri" w:hAnsi="Calibri"/>
-          <w:i w:val="0"/>
-          <w:color w:val="20262E"/>
-        </w:rPr>
-        <w:t>All three repositories contained uncommitted work at review time. The listed commit IDs identify the committed base, not the entire reviewed working tree. A final adoption baseline must be a clean, signed or otherwise immutable release reference with its exact source, dependencies, configuration, and evidence retained.</w:t>
+        <w:t>The publication baselines are tracker tag v1.4.22, RID2Caltopo tag v2.0.2(124), and website commit e4f26ad. These references identify the exact reviewed application source; this Board package is updated in a follow-up documentation commit after live verification. A final adoption baseline should retain exact source, dependencies, configuration, evidence, and rollback targets as signed or otherwise immutable release records.</w:t>
       </w:r>
     </w:p>
     <w:p>

</xml_diff>

<commit_message>
Refresh Board security review for published releases
</commit_message>
<xml_diff>
--- a/proposals/NCSSAR_RID2Caltopo_technical_security_review.docx
+++ b/proposals/NCSSAR_RID2Caltopo_technical_security_review.docx
@@ -157,7 +157,7 @@
                 <w:b/>
                 <w:color w:val="17365D"/>
               </w:rPr>
-              <w:t>RECOMMENDATION  Continue the limited NCSSAR-controlled pilot. Material source and no-outage cloud controls are now implemented, but adoption and external expansion should remain conditioned on institutional ownership, proven IAP-only host administration, backup/reconstruction evidence, tested monitoring/incident response, independent review, and field qualification.</w:t>
+              <w:t>RECOMMENDATION  Continue the limited NCSSAR-controlled pilot. Material source and no-outage cloud controls are now implemented, but adoption and external expansion should remain conditioned on institutional ownership, proven IAP-only host administration, backup/reconstruction evidence, tested monitoring/incident response, independent review, written CalTopo relationship review, and field qualification.</w:t>
             </w:r>
           </w:p>
         </w:tc>
@@ -189,7 +189,7 @@
         <w:keepLines w:val="0"/>
       </w:pPr>
       <w:r>
-        <w:t>The present assurance level remains pilot-grade. Tracker v1.4.22 is live on Cloud Run revision r2c-tracker-pilot-00089-8gd with 100 percent of traffic, and post-deployment checks confirmed its version record, HSTS, and rejection of an untrusted CORS preflight. Both public RID2Caltopo domains render the versioned best-effort acknowledgment. No-outage database-host controls are live, but public SSH and the VM public IP remain until a maintenance-window repair proves IAP access. Board-controlled ownership and recovery identities, alert destinations, backup/restore evidence, an incident tabletop, independent tenant/cloud review, full cross-platform supply-chain coverage, and managed-video field qualification remain open.</w:t>
+        <w:t>The present assurance level remains pilot-grade. Tracker v1.4.24 is live on Cloud Run revision r2c-tracker-pilot-00092-m68 with 100 percent of traffic, and post-deployment checks confirmed its version record, HSTS, rejection of an untrusted CORS preflight, and exclusion of restricted tenants from the public organization directory while direct authenticated access remains available. Both public RID2Caltopo domains render the versioned best-effort acknowledgment, neutral mySAR examples, and an independence statement explaining that RID2Caltopo is not affiliated with or endorsed by CalTopo and uses the CalTopo Teams API. No-outage database-host controls are live, but public SSH and the VM public IP remain until a maintenance-window repair proves IAP access. Board-controlled ownership and recovery identities, alert destinations, backup/restore evidence, an incident tabletop, independent tenant/cloud review, written CalTopo relationship review, full cross-platform supply-chain coverage, and managed-video field qualification remain open.</w:t>
       </w:r>
     </w:p>
     <w:p>
@@ -202,7 +202,7 @@
           <w:i w:val="0"/>
           <w:color w:val="20262E"/>
         </w:rPr>
-        <w:t>The appropriate Board decision remains conditional stewardship: continue the limited NCSSAR-controlled pilot, retain the completed controls, and close or explicitly accept the remaining institutional, host-access, recovery, monitoring, independent-review, and field-qualification risks before broader onboarding or payment.</w:t>
+        <w:t>The appropriate Board decision remains conditional stewardship: continue the limited NCSSAR-controlled pilot, retain the completed controls, and close or explicitly accept the remaining institutional, host-access, recovery, monitoring, independent-review, external-product/API, and field-qualification risks before broader onboarding or payment.</w:t>
       </w:r>
     </w:p>
     <w:p>
@@ -1035,7 +1035,7 @@
                 <w:rFonts w:ascii="Calibri" w:hAnsi="Calibri"/>
                 <w:sz w:val="17"/>
               </w:rPr>
-              <w:t>Commit 20defc43 plus uncommitted pilot work</w:t>
+              <w:t>Commit fdb993e and release tag v1.4.24</w:t>
             </w:r>
           </w:p>
         </w:tc>
@@ -1112,7 +1112,7 @@
                 <w:rFonts w:ascii="Calibri" w:hAnsi="Calibri"/>
                 <w:sz w:val="17"/>
               </w:rPr>
-              <w:t>Commit e69844ed plus uncommitted release/disclaimer work</w:t>
+              <w:t>Commit ad18a088 and release tag v2.0.3(125)</w:t>
             </w:r>
           </w:p>
         </w:tc>
@@ -1189,7 +1189,7 @@
                 <w:rFonts w:ascii="Calibri" w:hAnsi="Calibri"/>
                 <w:sz w:val="17"/>
               </w:rPr>
-              <w:t>Commit 8f8a72f plus uncommitted terms work</w:t>
+              <w:t>Commit de3a473; Cloudflare Worker and Sites publications verified</w:t>
             </w:r>
           </w:p>
         </w:tc>
@@ -1266,7 +1266,7 @@
                 <w:rFonts w:ascii="Calibri" w:hAnsi="Calibri"/>
                 <w:sz w:val="17"/>
               </w:rPr>
-              <w:t>Tracker 221 tests; website 7 rendered tests; focused Android and Apple disclaimer tests passed</w:t>
+              <w:t>Tracker 228 tests plus dependency/static/secret/SBOM gate; website 7 rendered tests; Android releaseCheck and Apple package/disclaimer tests passed</w:t>
             </w:r>
           </w:p>
         </w:tc>
@@ -2178,7 +2178,7 @@
         <w:rPr>
           <w:rFonts w:ascii="Calibri" w:hAnsi="Calibri"/>
         </w:rPr>
-        <w:t>Cloud Run revision r2c-tracker-pilot-00088-26q served 100% of traffic from an image digest, using a dedicated runtime service account, one-instance application limit, 1 GiB memory, and Direct VPC egress.</w:t>
+        <w:t>Cloud Run revision r2c-tracker-pilot-00092-m68 served 100% of traffic from an image digest, using a dedicated runtime service account, one-instance application limit, 1 GiB memory, and Direct VPC egress.</w:t>
       </w:r>
     </w:p>
     <w:p>
@@ -4233,7 +4233,7 @@
           </w:tcPr>
           <w:p>
             <w:r>
-              <w:t>Production-Python gate passes 227 tests, dependency audit with no known vulnerabilities, medium/high static analysis, secret-baseline enforcement, and CycloneDX SBOM generation; website rendered tests, Android releaseCheck, Apple package tests, and mobile disclaimer tests pass.</w:t>
+              <w:t>Production-Python gate passes 228 tests, dependency audit with no known vulnerabilities, medium/high static analysis, secret-baseline enforcement, and CycloneDX SBOM generation; website rendered tests, Android releaseCheck, Apple package tests, and mobile disclaimer tests pass.</w:t>
             </w:r>
           </w:p>
         </w:tc>
@@ -4250,7 +4250,7 @@
           </w:tcPr>
           <w:p>
             <w:r>
-              <w:t>Published release baseline: tracker v1.4.22 is live and RID2Caltopo 2.0.2 build 124 is tagged; independent review, store-distributed physical-device checks, and full cross-platform provenance remain open.</w:t>
+              <w:t>Published release baseline: tracker v1.4.24 is live on revision r2c-tracker-pilot-00092-m68; RID2Caltopo 2.0.3 build 125 is tagged; website commit de3a473, Cloudflare Worker version 8c95a50d-9941-4c06-920c-d9837639df52, and Sites version 16 are published. Independent review, store-distributed physical-device checks, and full cross-platform provenance remain open.</w:t>
             </w:r>
           </w:p>
         </w:tc>
@@ -5460,7 +5460,7 @@
                 <w:rFonts w:ascii="Calibri" w:hAnsi="Calibri"/>
                 <w:sz w:val="17"/>
               </w:rPr>
-              <w:t>CalTopo, FAA, Google, map providers, Cloud Run, database VM, and TURN are external dependencies.</w:t>
+              <w:t>CalTopo, FAA, Google, map providers, Cloud Run, database VM, and TURN are external dependencies. Public materials now disclose that RID2Caltopo is independent, is not affiliated with or endorsed by CalTopo, and uses the CalTopo Teams API; direct vendor review remains open.</w:t>
             </w:r>
           </w:p>
         </w:tc>
@@ -5484,7 +5484,7 @@
                 <w:rFonts w:ascii="Calibri" w:hAnsi="Calibri"/>
                 <w:sz w:val="17"/>
               </w:rPr>
-              <w:t>Document failure modes, status indicators, fallback, vendor terms, and discontinuation plan.</w:t>
+              <w:t>Document failure modes, status indicators, fallback, vendor terms, and discontinuation plan. Demonstrate the ecosystem to CalTopo founder Matt Jacobs, request written confirmation on name, Teams API use and attribution, retain the response, and disposition any requested changes.</w:t>
             </w:r>
           </w:p>
         </w:tc>
@@ -7765,7 +7765,7 @@
           </w:tcPr>
           <w:p>
             <w:r>
-              <w:t>PARTIAL: route/query/storage/WebSocket matrix and 227-test gate pass; archive restore is bounded; focused independent adversarial review remains</w:t>
+              <w:t>PARTIAL: route/query/storage/WebSocket matrix and 228-test gate pass; archive restore is bounded; focused independent adversarial review remains</w:t>
             </w:r>
           </w:p>
         </w:tc>
@@ -8554,7 +8554,7 @@
         <w:rPr>
           <w:rFonts w:ascii="Calibri" w:hAnsi="Calibri"/>
         </w:rPr>
-        <w:t>Review the complete working-tree differences before establishing the transfer baseline; do not treat uncommitted pilot code as a reproducible release.</w:t>
+        <w:t>Use the checkpointed tracker v1.4.24, RID2Caltopo v2.0.3(125), and website commit de3a473 as the current review baseline; repeat working-tree, dependency, configuration, and evidence reconciliation before any future transfer or production release.</w:t>
       </w:r>
     </w:p>
     <w:p>
@@ -9872,7 +9872,7 @@
         </w:numPr>
       </w:pPr>
       <w:r>
-        <w:t>Google Cloud observations and controlled changes on August 7-8, 2026: Cloud Run service/revision and IAM, runtime secret references and access roles, bucket controls/IAM, VPC routes, Compute Engine VM/disk posture, firewall rules, deletion protection, removal of unused public-web tags, logged RDP denial, and additive IAP access configuration. Post-deployment evidence includes tracker revision r2c-tracker-pilot-00089-8gd at 100 percent traffic, live v1.4.22 release notes, HSTS, untrusted-origin CORS rejection, and both public RID2Caltopo acknowledgment pages. No secret payloads were accessed.</w:t>
+        <w:t>Google Cloud observations and controlled changes on August 7-8, 2026: Cloud Run service/revision and IAM, runtime secret references and access roles, bucket controls/IAM, VPC routes, Compute Engine VM/disk posture, firewall rules, deletion protection, removal of unused public-web tags, logged RDP denial, and additive IAP access configuration. Post-deployment evidence includes tracker revision r2c-tracker-pilot-00092-m68 at 100 percent traffic, live v1.4.24 release notes, HSTS, untrusted-origin CORS rejection, exclusion of restricted tenants from the public directory, successful direct tenant sign-in routing, and both public RID2Caltopo acknowledgment pages with neutral mySAR examples and CalTopo independence/API language. No secret payloads were accessed.</w:t>
       </w:r>
     </w:p>
     <w:p>
@@ -9888,7 +9888,7 @@
         <w:keepLines w:val="0"/>
       </w:pPr>
       <w:r>
-        <w:t>The publication baselines are tracker tag v1.4.22, RID2Caltopo tag v2.0.2(124), and website commit e4f26ad. These references identify the exact reviewed application source; this Board package is updated in a follow-up documentation commit after live verification. A final adoption baseline should retain exact source, dependencies, configuration, evidence, and rollback targets as signed or otherwise immutable release records.</w:t>
+        <w:t>The publication baselines are tracker tag v1.4.24, RID2Caltopo tag v2.0.3(125), and website commit de3a473. The hosted website evidence is Cloudflare Worker version 8c95a50d-9941-4c06-920c-d9837639df52 and Sites version 16. These references identify the exact reviewed application source and publication state; this Board package is updated in a follow-up documentation commit after live verification. A final adoption baseline should retain exact source, dependencies, configuration, evidence, vendor correspondence, and rollback targets as signed or otherwise immutable release records.</w:t>
       </w:r>
     </w:p>
     <w:p>

</xml_diff>